<commit_message>
sync: 2026-07-14 09:27:32 from Cowork
</commit_message>
<xml_diff>
--- a/outputs/cv.docx
+++ b/outputs/cv.docx
@@ -392,14 +392,10 @@
         <w:jc w:val="both"/>
       </w:pPr>
       <w:r>
-        <w:t xml:space="preserve">Prosus has been my operating benchmark for 12+ years. I’ve built a portfolio of category-leading classifieds, e-commerce and fintech businesses across 10+ emerging markets </w:t>
-      </w:r>
-      <w:r>
-        <w:t xml:space="preserve">, </w:t>
-      </w:r>
-      <w:r>
-        <w:t>the same playbook eMAG, Takealot and OLX have run inside the Prosus ecosystem. Joining the European Ecosystem team is the natural next chapter: shifting from building this thesis at Zubr scale to executing it across Prosus’s portfolio.</w:t>
-      </w:r>
+        <w:t>Prosus has been my operating benchmark for 12+ years. At Zubr Capital I built a portfolio of category-leading classifieds, e-commerce and fintech platforms across 10+ emerging markets — the same playbook eMAG, Takealot, OLX and Izyico run inside the Prosus ecosystem. As Growth Lead, Europe, I would move from building this thesis at fund scale to executing it across Prosus's European portfolio: turning portfolio data into growth narratives, and growth narratives into results.</w:t>
+      </w:r>
+      <w:r/>
+      <w:r/>
     </w:p>
     <w:p>
       <w:pPr>
@@ -434,52 +430,31 @@
         </w:rPr>
       </w:pPr>
       <w:r>
-        <w:t>Venture investor and hands-on operator with 12+ years of experience</w:t>
+        <w:t>Venture investor and hands-on operator with 12+ years of experience on both sides of the table — as an investor and as an active builder inside portfolio companies. Progressed from analyst to Partner at Zubr Capital, building the investment team from scratch and serving on the Boards of 11 multi-country, emerging-markets portfolio companies; in critical moments I stepped in as acting CEO to lead operational turnarounds firsthand. Operator and strategist in equal measure: I run monthly operational reviews and quarterly OKR cycles with portfolio CFOs and CEOs across multi-country portfolios, connecting macroeconomic trends, competitive dynamics and company-level data into a single coherent growth narrative.</w:t>
       </w:r>
       <w:r>
         <w:rPr>
           <w:lang w:val="en-US"/>
         </w:rPr>
-        <w:t xml:space="preserve">, </w:t>
-      </w:r>
-      <w:r>
-        <w:t xml:space="preserve">spanning both sides of the table: as an investor and as an active builder inside portfolio companies. Progressed from analyst to Partner at Zubr Capital, building the investment team from scratch and serving on the Board of Directors of </w:t>
-      </w:r>
-      <w:r>
-        <w:t xml:space="preserve">11 </w:t>
-      </w:r>
-      <w:r>
-        <w:t>Multi-country emerging-markets portfolio</w:t>
-      </w:r>
-      <w:r>
-        <w:t xml:space="preserve"> </w:t>
-      </w:r>
-      <w:r>
-        <w:t xml:space="preserve"> companies. In critical moments, stepped in as acting CEO to lead operational turnarounds firsthand.</w:t>
-      </w:r>
-      <w:r>
-        <w:t xml:space="preserve"> I have </w:t>
-      </w:r>
-      <w:r>
-        <w:t xml:space="preserve">Operator + </w:t>
-      </w:r>
+      </w:r>
+      <w:r/>
+      <w:r/>
+      <w:r/>
+      <w:r/>
+      <w:r/>
+      <w:r/>
+      <w:r/>
       <w:r>
         <w:rPr>
           <w:lang w:val="en-US"/>
         </w:rPr>
-        <w:t>S</w:t>
-      </w:r>
-      <w:r>
-        <w:t>rategist</w:t>
-      </w:r>
-      <w:r>
-        <w:t xml:space="preserve"> expirience</w:t>
-      </w:r>
+      </w:r>
+      <w:r/>
+      <w:r/>
       <w:r>
         <w:rPr>
           <w:lang w:val="en-US"/>
         </w:rPr>
-        <w:t xml:space="preserve">, </w:t>
       </w:r>
       <w:r>
         <w:rPr>
@@ -487,18 +462,14 @@
           <w:color w:val="000000"/>
           <w:lang w:val="en-US"/>
         </w:rPr>
-        <w:t>r</w:t>
       </w:r>
       <w:r>
         <w:rPr>
           <w:rFonts w:ascii="Cambria" w:hAnsi="Cambria"/>
           <w:color w:val="000000"/>
         </w:rPr>
-        <w:t>an monthly operational reviews and OKR cycles with portfolio CFOs and CEOs across multi-country portfolios.</w:t>
-      </w:r>
-      <w:r>
-        <w:t>I understand the emerging market very well and have already built successful businesses in such regions.</w:t>
-      </w:r>
+      </w:r>
+      <w:r/>
     </w:p>
     <w:p>
       <w:pPr>
@@ -507,17 +478,11 @@
         <w:jc w:val="both"/>
       </w:pPr>
       <w:r>
-        <w:t xml:space="preserve">Deep expertise in identifying high-potential teams early and partnering with them to reach market leadership across fintech, e-commerce, classifieds, creator economy, and B2C apps. Two portfolio companies reached unicorn status: Flo Health (global #1 women’s health app) and Noventiq (Nasdaq-listed B2B tech). </w:t>
-      </w:r>
-      <w:r>
-        <w:t xml:space="preserve">Unique expertise im </w:t>
-      </w:r>
-      <w:r>
-        <w:t>E-commerce + classifieds + fintech monetisation: 21vek $30M → $600M, av.by ARPU $2 → $800</w:t>
-      </w:r>
-      <w:r>
-        <w:t>.</w:t>
-      </w:r>
+        <w:t>Deep expertise identifying high-potential teams early and partnering with them to reach market leadership across fintech, e-commerce, classifieds, creator economy and B2C apps. Two portfolio companies reached unicorn status: Flo Health (global #1 women's-health app) and Noventiq (Nasdaq-listed B2B tech). Proven at unlocking e-commerce, classifieds and fintech monetisation: 21vek $30M → $600M, av.by ARPU $2 → $800.</w:t>
+      </w:r>
+      <w:r/>
+      <w:r/>
+      <w:r/>
     </w:p>
     <w:p>
       <w:pPr>
@@ -530,23 +495,13 @@
           <w:rFonts w:ascii="Cambria" w:hAnsi="Cambria"/>
           <w:color w:val="000000"/>
         </w:rPr>
-        <w:t xml:space="preserve">I </w:t>
-      </w:r>
-      <w:r>
-        <w:t xml:space="preserve">manage </w:t>
-      </w:r>
-      <w:r>
-        <w:t>M&amp;A end-to-end: sourcing, DD, structuring, $250M+ deployed</w:t>
-      </w:r>
-      <w:r>
-        <w:t>,running and sale.</w:t>
-      </w:r>
-      <w:r>
-        <w:t xml:space="preserve"> </w:t>
-      </w:r>
-      <w:r>
-        <w:t>I designed and deployed 20+ Claude-based agents and skills covering the full PE workflow: sourcing, due-diligence support, board pack drafting, KPI dashboards, OKR review packs, and investment-memo generation. Treating AI as core operating leverage, not a side experiment and bringing this toolkit directly into the portfolio.</w:t>
-      </w:r>
+        <w:t>I run M&amp;A and business development end-to-end — sourcing, due diligence, structuring, $250M+ deployed, portfolio management and exit. I also designed and deployed 20+ Claude-based agents and skills covering the full PE workflow: sourcing, due-diligence support, board-pack drafting, KPI dashboards, OKR review packs and investment-memo generation — treating AI as core operating leverage, not a side experiment, and ready to bring this toolkit directly into the portfolio.</w:t>
+      </w:r>
+      <w:r/>
+      <w:r/>
+      <w:r/>
+      <w:r/>
+      <w:r/>
     </w:p>
     <w:p>
       <w:pPr>
@@ -712,29 +667,15 @@
         <w:jc w:val="both"/>
       </w:pPr>
       <w:r>
-        <w:t>Run monthly operational reviews and quarterly OKR cycles for 25+ portfolio companies</w:t>
-      </w:r>
-      <w:r>
-        <w:t xml:space="preserve"> (</w:t>
-      </w:r>
-      <w:r>
-        <w:t>e-commerce, fintech, and creator economy</w:t>
-      </w:r>
-      <w:r>
-        <w:t>)</w:t>
-      </w:r>
-      <w:r>
-        <w:t xml:space="preserve"> across 10+ emerging markets</w:t>
-      </w:r>
-      <w:r>
-        <w:t>:</w:t>
-      </w:r>
-      <w:r>
-        <w:t xml:space="preserve"> pressure-testing P&amp;L, surfacing 2–3 critical growth levers per cycle, and partnering with CFOs/COOs on budget delivery and operational</w:t>
-      </w:r>
-      <w:r>
-        <w:t>.</w:t>
-      </w:r>
+        <w:t>Run monthly operational reviews and quarterly OKR cycles for 25+ portfolio companies (e-commerce, fintech and creator economy) across 10+ emerging markets: pressure-testing P&amp;L, surfacing 2–3 critical growth levers per cycle, and partnering with CFOs/COOs on budget delivery and operational execution.</w:t>
+      </w:r>
+      <w:r/>
+      <w:r/>
+      <w:r/>
+      <w:r/>
+      <w:r/>
+      <w:r/>
+      <w:r/>
     </w:p>
     <w:p>
       <w:pPr>
@@ -798,7 +739,7 @@
         <w:jc w:val="both"/>
       </w:pPr>
       <w:r>
-        <w:t>Backed Flo Health and Noventiq from early stage  both reached unicorn status.</w:t>
+        <w:t>Backed Flo Health and Noventiq from early stage — both reached unicorn status.</w:t>
       </w:r>
     </w:p>
     <w:p>
@@ -873,32 +814,16 @@
         <w:jc w:val="both"/>
       </w:pPr>
       <w:r>
-        <w:t>Co-founded two startups: a Shopify-native SaaS application</w:t>
-      </w:r>
-      <w:r>
-        <w:t>s</w:t>
-      </w:r>
-      <w:r>
-        <w:t xml:space="preserve"> and a </w:t>
-      </w:r>
-      <w:r>
-        <w:t>UA-</w:t>
-      </w:r>
-      <w:r>
-        <w:t>factoring broker for gaming</w:t>
-      </w:r>
-      <w:r>
-        <w:t xml:space="preserve"> (</w:t>
-      </w:r>
-      <w:r>
-        <w:t>both live and operating</w:t>
-      </w:r>
-      <w:r>
-        <w:t>)</w:t>
-      </w:r>
-      <w:r>
-        <w:t>.</w:t>
-      </w:r>
+        <w:t>Co-founded two startups: a Shopify-native SaaS app and a user-acquisition factoring broker for gaming (both live and operating).</w:t>
+      </w:r>
+      <w:r/>
+      <w:r/>
+      <w:r/>
+      <w:r/>
+      <w:r/>
+      <w:r/>
+      <w:r/>
+      <w:r/>
     </w:p>
     <w:p>
       <w:pPr>

</xml_diff>

<commit_message>
sync: 2026-07-14 10:56:09 from Cowork
</commit_message>
<xml_diff>
--- a/outputs/cv.docx
+++ b/outputs/cv.docx
@@ -779,8 +779,7 @@
         <w:jc w:val="both"/>
       </w:pPr>
       <w:r>
-        <w:lastRenderedPageBreak/>
-        <w:t>Stepped in as interim CEO of realt.by (Belarus’ #1 real estate classifieds, 100+ employees) during leadership transition; successfully migrated business model to freemium without revenue loss, achieving growth during the transition period.</w:t>
+        <w:t>Stepped in as interim CEO of realt.by (a leading emerging-markets real-estate classifieds platform, 100+ employees) during leadership transition; successfully migrated business model to freemium without revenue loss, achieving growth during the transition period.</w:t>
       </w:r>
     </w:p>
     <w:p>
@@ -976,7 +975,7 @@
                 <w:sz w:val="19"/>
                 <w:szCs w:val="19"/>
               </w:rPr>
-              <w:t xml:space="preserve">Minsk, BY </w:t>
+              <w:t xml:space="preserve">Emerging markets </w:t>
             </w:r>
           </w:p>
         </w:tc>
@@ -1017,7 +1016,24 @@
         <w:spacing w:before="40" w:after="40"/>
       </w:pPr>
       <w:r>
-        <w:t>Identified and partnered with 21vek.by (Belarus’ leading e-commerce platform) when revenue was $30M; through board involvement and strategic partnership, supported its growth to $600M+ in 5 years on local market.</w:t>
+        <w:t>As the classifieds portfolio scaled, acquired platforms in new regions and successfully integrated them into the core business — consolidating them onto shared monetisation, product and operating models to build a multi-country classifieds group (Larixon Classifieds Group).</w:t>
+      </w:r>
+      <w:r/>
+      <w:r/>
+      <w:r/>
+      <w:r/>
+    </w:p>
+    <w:p>
+      <w:pPr>
+        <w:pStyle w:val="a4"/>
+        <w:numPr>
+          <w:ilvl w:val="0"/>
+          <w:numId w:val="2"/>
+        </w:numPr>
+        <w:spacing w:before="40" w:after="40"/>
+      </w:pPr>
+      <w:r>
+        <w:t>Identified and partnered with 21vek.by (a leading emerging-markets e-commerce platform) when revenue was $30M; through board involvement and strategic partnership, supported its growth to $600M+ in 5 years on local market.</w:t>
       </w:r>
     </w:p>
     <w:p>
@@ -2174,7 +2190,7 @@
                 <w:sz w:val="19"/>
                 <w:szCs w:val="19"/>
               </w:rPr>
-              <w:t>Real Estate (Ukraine)</w:t>
+              <w:t>Real Estate (Emerging markets)</w:t>
             </w:r>
           </w:p>
         </w:tc>
@@ -2228,14 +2244,13 @@
                 <w:sz w:val="19"/>
                 <w:szCs w:val="19"/>
               </w:rPr>
-              <w:t>Market leader in UA</w:t>
-            </w:r>
-            <w:r>
-              <w:rPr>
-                <w:sz w:val="19"/>
-                <w:szCs w:val="19"/>
-              </w:rPr>
-              <w:t xml:space="preserve"> (new homes)</w:t>
+              <w:t>Market leader (new homes)</w:t>
+            </w:r>
+            <w:r>
+              <w:rPr>
+                <w:sz w:val="19"/>
+                <w:szCs w:val="19"/>
+              </w:rPr>
             </w:r>
           </w:p>
         </w:tc>

</xml_diff>

<commit_message>
sync: 2026-07-14 11:06:38 from Cowork
</commit_message>
<xml_diff>
--- a/outputs/cv.docx
+++ b/outputs/cv.docx
@@ -111,6 +111,155 @@
     </w:tbl>
     <w:p>
       <w:pPr>
+        <w:pStyle w:val="a4"/>
+        <w:numPr>
+          <w:ilvl w:val="0"/>
+          <w:numId w:val="2"/>
+        </w:numPr>
+        <w:spacing w:before="40" w:after="40"/>
+        <w:jc w:val="both"/>
+      </w:pPr>
+      <w:r>
+        <w:t>Building OpenBaaS (openbaas.io), a Banking-as-a-Service platform for marketplaces, together with my partners; already onboarded first customers and leading product, go-to-market and fundraising.</w:t>
+      </w:r>
+      <w:r/>
+      <w:r/>
+      <w:r/>
+      <w:r/>
+      <w:r/>
+      <w:r/>
+      <w:r/>
+    </w:p>
+    <w:p>
+      <w:pPr>
+        <w:pStyle w:val="a4"/>
+        <w:numPr>
+          <w:ilvl w:val="0"/>
+          <w:numId w:val="2"/>
+        </w:numPr>
+        <w:spacing w:before="40" w:after="40"/>
+        <w:jc w:val="both"/>
+      </w:pPr>
+      <w:r>
+        <w:t>Gradually transitioning out of my day-to-day operational role at Zubr Capital to focus on scaling this fintech, while remaining an active Board member across the portfolio.</w:t>
+      </w:r>
+      <w:r/>
+      <w:r/>
+      <w:r/>
+      <w:r/>
+      <w:r/>
+      <w:r/>
+      <w:r/>
+    </w:p>
+    <w:tbl>
+      <w:tblPr>
+        <w:tblW w:w="6400" w:type="dxa"/>
+        <w:tblBorders>
+          <w:top w:val="none" w:sz="0" w:space="0" w:color="FFFFFF"/>
+          <w:left w:val="none" w:sz="0" w:space="0" w:color="FFFFFF"/>
+          <w:bottom w:val="none" w:sz="0" w:space="0" w:color="FFFFFF"/>
+          <w:right w:val="none" w:sz="0" w:space="0" w:color="FFFFFF"/>
+          <w:insideH w:val="single" w:sz="4" w:space="0" w:color="auto"/>
+          <w:insideV w:val="single" w:sz="4" w:space="0" w:color="auto"/>
+        </w:tblBorders>
+        <w:tblCellMar>
+          <w:left w:w="10" w:type="dxa"/>
+          <w:right w:w="10" w:type="dxa"/>
+        </w:tblCellMar>
+        <w:tblLook w:val="0000" w:firstRow="0" w:lastRow="0" w:firstColumn="0" w:lastColumn="0" w:noHBand="0" w:noVBand="0"/>
+      </w:tblPr>
+      <w:tblGrid>
+        <w:gridCol w:w="6400"/>
+      </w:tblGrid>
+      <w:tr>
+        <w:tc>
+          <w:tcPr>
+            <w:tcW w:w="6400" w:type="dxa"/>
+            <w:tcBorders>
+              <w:top w:val="none" w:sz="0" w:space="0" w:color="FFFFFF"/>
+              <w:left w:val="none" w:sz="0" w:space="0" w:color="FFFFFF"/>
+              <w:bottom w:val="none" w:sz="0" w:space="0" w:color="FFFFFF"/>
+              <w:right w:val="none" w:sz="0" w:space="0" w:color="FFFFFF"/>
+            </w:tcBorders>
+            <w:tcMar>
+              <w:top w:w="0" w:type="dxa"/>
+              <w:left w:w="0" w:type="dxa"/>
+              <w:bottom w:w="0" w:type="dxa"/>
+              <w:right w:w="200" w:type="dxa"/>
+            </w:tcMar>
+          </w:tcPr>
+          <w:p>
+            <w:pPr>
+              <w:spacing w:after="60"/>
+            </w:pPr>
+            <w:r>
+              <w:rPr>
+                <w:b/>
+                <w:bCs/>
+                <w:color w:val="1A5276"/>
+                <w:sz w:val="48"/>
+                <w:szCs w:val="48"/>
+              </w:rPr>
+              <w:t>VIKTAR DZENISEVICH</w:t>
+            </w:r>
+          </w:p>
+          <w:p>
+            <w:pPr>
+              <w:spacing w:after="40"/>
+              <w:rPr>
+                <w:rFonts w:ascii="Cambria" w:hAnsi="Cambria"/>
+                <w:i/>
+                <w:iCs/>
+                <w:color w:val="000000"/>
+                <w:lang w:val="ru-RU"/>
+              </w:rPr>
+            </w:pPr>
+            <w:r>
+              <w:rPr>
+                <w:rFonts w:ascii="Cambria" w:hAnsi="Cambria"/>
+                <w:i/>
+                <w:iCs/>
+                <w:color w:val="000000"/>
+              </w:rPr>
+              <w:t>Partner &amp; Investment Director | Portfolio Value Creation | M&amp;A &amp; Growth Strategy | Emerging-Markets E-commerce, Classifieds &amp; Fintech</w:t>
+            </w:r>
+          </w:p>
+          <w:p>
+            <w:pPr>
+              <w:spacing w:after="40"/>
+            </w:pPr>
+            <w:r>
+              <w:rPr>
+                <w:color w:val="5D6D7E"/>
+                <w:sz w:val="19"/>
+                <w:szCs w:val="19"/>
+              </w:rPr>
+              <w:t>Amsterdam, Netherlands  ·  denwik86@gmail.com  ·  +31 617 471 410</w:t>
+            </w:r>
+          </w:p>
+          <w:p>
+            <w:pPr>
+              <w:rPr>
+                <w:lang w:val="ru-RU"/>
+              </w:rPr>
+            </w:pPr>
+            <w:hyperlink r:id="rId5" w:history="1">
+              <w:r>
+                <w:rPr>
+                  <w:color w:val="1A5276"/>
+                  <w:sz w:val="19"/>
+                  <w:szCs w:val="19"/>
+                  <w:u w:val="single"/>
+                </w:rPr>
+                <w:t>linkedin.com/in/viktar-dzenisevich</w:t>
+              </w:r>
+            </w:hyperlink>
+          </w:p>
+        </w:tc>
+      </w:tr>
+    </w:tbl>
+    <w:p>
+      <w:pPr>
         <w:spacing w:after="40"/>
       </w:pPr>
     </w:p>
@@ -392,7 +541,7 @@
         <w:jc w:val="both"/>
       </w:pPr>
       <w:r>
-        <w:t>Prosus has been my operating benchmark for 12+ years — joining it has been a deliberate goal of mine for over a decade, and this is my third application. At Zubr Capital I built a portfolio of category-leading classifieds, e-commerce and fintech platforms across 10+ emerging markets — the same playbook eMAG, Takealot, OLX and Izyico run inside the Prosus ecosystem. Today I'm also building my own fintech — a Banking-as-a-Service platform for marketplaces — so I know the classifieds-to-fintech monetisation path not only as an investor but as a founder shipping it. As Growth Lead, Europe, I would move from building this thesis at fund scale to executing it across Prosus's European portfolio: turning portfolio data into growth narratives, and growth narratives into results.</w:t>
+        <w:t>Prosus has been my operating benchmark for 12+ years, and joining it has been a deliberate goal of mine for over a decade; this is my third application. At Zubr Capital I built a portfolio of category-leading classifieds, e-commerce and fintech platforms across 10+ emerging markets, the same playbook eMAG, Takealot, OLX and Izyico run inside the Prosus ecosystem. I am now gradually stepping back from my operational role at Zubr Capital to focus, together with my partners, on building OpenBaaS (openbaas.io), a Banking-as-a-Service platform for marketplaces that already has its first customers, so I know the classifieds-to-fintech monetisation path not only as an investor but as a founder shipping it. As Growth Lead, Europe, I would move from building this thesis at fund scale to executing it across Prosus's European portfolio: turning portfolio data into growth narratives, and growth narratives into results.</w:t>
       </w:r>
       <w:r/>
       <w:r/>
@@ -430,7 +579,7 @@
         </w:rPr>
       </w:pPr>
       <w:r>
-        <w:t>Venture investor and hands-on operator with 12+ years of experience on both sides of the table — as an investor and as an active builder inside portfolio companies. Progressed from analyst to Partner at Zubr Capital, building the investment team from scratch and serving on the Boards of 11 multi-country, emerging-markets portfolio companies; in critical moments I stepped in as acting CEO to lead operational turnarounds firsthand. Operator and strategist in equal measure: I run monthly operational reviews and quarterly OKR cycles with portfolio CFOs and CEOs across multi-country portfolios, connecting macroeconomic trends, competitive dynamics and company-level data into a single coherent growth narrative.</w:t>
+        <w:t>Venture investor and hands-on operator with 12+ years of experience on both sides of the table, as an investor and as an active builder inside portfolio companies. Progressed from analyst to Partner at Zubr Capital, building the investment team from scratch and serving on the Boards of 11 multi-country, emerging-markets portfolio companies; in critical moments I stepped in as acting CEO to lead operational turnarounds firsthand. Operator and strategist in equal measure: I run monthly operational reviews and quarterly OKR cycles with portfolio CFOs and CEOs across multi-country portfolios, connecting macroeconomic trends, competitive dynamics and company-level data into a single coherent growth narrative.</w:t>
       </w:r>
       <w:r>
         <w:rPr>
@@ -495,7 +644,7 @@
           <w:rFonts w:ascii="Cambria" w:hAnsi="Cambria"/>
           <w:color w:val="000000"/>
         </w:rPr>
-        <w:t>I run M&amp;A and business development end-to-end — sourcing, due diligence, structuring, $250M+ deployed, portfolio management and exit. I also designed and deployed 20+ Claude-based agents and skills covering the full PE workflow: sourcing, due-diligence support, board-pack drafting, KPI dashboards, OKR review packs and investment-memo generation — treating AI as core operating leverage, not a side experiment, and ready to bring this toolkit directly into the portfolio.</w:t>
+        <w:t>I run M&amp;A and business development end-to-end, sourcing, due diligence, structuring, $250M+ deployed, portfolio management and exit. I also designed and deployed 20+ Claude-based agents and skills covering the full PE workflow: sourcing, due-diligence support, board-pack drafting, KPI dashboards, OKR review packs and investment-memo generation, treating AI as core operating leverage, not a side experiment, and ready to bring this toolkit directly into the portfolio.</w:t>
       </w:r>
       <w:r/>
       <w:r/>
@@ -588,7 +737,7 @@
                 <w:iCs/>
                 <w:color w:val="1A5276"/>
               </w:rPr>
-              <w:t xml:space="preserve">Zubr Capital — Private Equity &amp; </w:t>
+              <w:t xml:space="preserve">Zubr Capital, Private Equity &amp; </w:t>
             </w:r>
             <w:r>
               <w:rPr>
@@ -739,7 +888,7 @@
         <w:jc w:val="both"/>
       </w:pPr>
       <w:r>
-        <w:t>Backed Flo Health and Noventiq from early stage — both reached unicorn status.</w:t>
+        <w:t>Backed Flo Health and Noventiq from early stage, both reached unicorn status.</w:t>
       </w:r>
     </w:p>
     <w:p>
@@ -929,7 +1078,7 @@
                 <w:iCs/>
                 <w:color w:val="1A5276"/>
               </w:rPr>
-              <w:t>Zubr Capital — Private Equity &amp; Growth Fund</w:t>
+              <w:t>Zubr Capital, Private Equity &amp; Growth Fund</w:t>
             </w:r>
           </w:p>
         </w:tc>
@@ -1016,7 +1165,7 @@
         <w:spacing w:before="40" w:after="40"/>
       </w:pPr>
       <w:r>
-        <w:t>As the classifieds portfolio scaled, acquired platforms in new regions and successfully integrated them into the core business — consolidating them onto shared monetisation, product and operating models to build a multi-country classifieds group (Larixon Classifieds Group).</w:t>
+        <w:t>As the classifieds portfolio scaled, acquired platforms in new regions and successfully integrated them into the core business, consolidating them onto shared monetisation, product and operating models to build a multi-country classifieds group (Larixon Classifieds Group).</w:t>
       </w:r>
       <w:r/>
       <w:r/>
@@ -3041,7 +3190,7 @@
                 <w:sz w:val="19"/>
                 <w:szCs w:val="19"/>
               </w:rPr>
-              <w:t>English — Fluent</w:t>
+              <w:t>English, Fluent</w:t>
             </w:r>
           </w:p>
           <w:p>
@@ -3053,7 +3202,7 @@
                 <w:sz w:val="19"/>
                 <w:szCs w:val="19"/>
               </w:rPr>
-              <w:t>Russian — Native</w:t>
+              <w:t>Russian, Native</w:t>
             </w:r>
           </w:p>
           <w:p>
@@ -3065,7 +3214,7 @@
                 <w:sz w:val="19"/>
                 <w:szCs w:val="19"/>
               </w:rPr>
-              <w:t>Belarusian — Native</w:t>
+              <w:t>Belarusian, Native</w:t>
             </w:r>
           </w:p>
           <w:p>
@@ -3077,7 +3226,7 @@
                 <w:sz w:val="19"/>
                 <w:szCs w:val="19"/>
               </w:rPr>
-              <w:t xml:space="preserve">Ukrainian — </w:t>
+              <w:t xml:space="preserve">Ukrainian, </w:t>
             </w:r>
             <w:r>
               <w:rPr>
@@ -3093,7 +3242,7 @@
                 <w:sz w:val="19"/>
                 <w:szCs w:val="19"/>
               </w:rPr>
-              <w:t>Polish — Basic</w:t>
+              <w:t>Polish, Basic</w:t>
             </w:r>
           </w:p>
         </w:tc>
@@ -3137,7 +3286,7 @@
         <w:spacing w:before="40" w:after="40"/>
       </w:pPr>
       <w:r>
-        <w:t>Project Expert, USAID — Reviewed and evaluated candidates for entrepreneurship and innovation training programmes.</w:t>
+        <w:t>Project Expert, USAID, Reviewed and evaluated candidates for entrepreneurship and innovation training programmes.</w:t>
       </w:r>
     </w:p>
     <w:p>
@@ -3150,7 +3299,7 @@
         <w:spacing w:before="40" w:after="40"/>
       </w:pPr>
       <w:r>
-        <w:t>Teacher, Imaguru Global — Delivered educational sessions on entrepreneurship and venture finance.</w:t>
+        <w:t>Teacher, Imaguru Global, Delivered educational sessions on entrepreneurship and venture finance.</w:t>
       </w:r>
     </w:p>
     <w:sectPr>

</xml_diff>

<commit_message>
sync: 2026-07-14 11:07:31 from Cowork
</commit_message>
<xml_diff>
--- a/outputs/cv.docx
+++ b/outputs/cv.docx
@@ -2,155 +2,6 @@
 <file path=word/document.xml><?xml version="1.0" encoding="utf-8"?>
 <w:document xmlns:wpc="http://schemas.microsoft.com/office/word/2010/wordprocessingCanvas" xmlns:cx="http://schemas.microsoft.com/office/drawing/2014/chartex" xmlns:cx1="http://schemas.microsoft.com/office/drawing/2015/9/8/chartex" xmlns:cx2="http://schemas.microsoft.com/office/drawing/2015/10/21/chartex" xmlns:cx3="http://schemas.microsoft.com/office/drawing/2016/5/9/chartex" xmlns:cx4="http://schemas.microsoft.com/office/drawing/2016/5/10/chartex" xmlns:cx5="http://schemas.microsoft.com/office/drawing/2016/5/11/chartex" xmlns:cx6="http://schemas.microsoft.com/office/drawing/2016/5/12/chartex" xmlns:cx7="http://schemas.microsoft.com/office/drawing/2016/5/13/chartex" xmlns:cx8="http://schemas.microsoft.com/office/drawing/2016/5/14/chartex" xmlns:mc="http://schemas.openxmlformats.org/markup-compatibility/2006" xmlns:aink="http://schemas.microsoft.com/office/drawing/2016/ink" xmlns:am3d="http://schemas.microsoft.com/office/drawing/2017/model3d" xmlns:o="urn:schemas-microsoft-com:office:office" xmlns:oel="http://schemas.microsoft.com/office/2019/extlst" xmlns:r="http://schemas.openxmlformats.org/officeDocument/2006/relationships" xmlns:m="http://schemas.openxmlformats.org/officeDocument/2006/math" xmlns:v="urn:schemas-microsoft-com:vml" xmlns:wp14="http://schemas.microsoft.com/office/word/2010/wordprocessingDrawing" xmlns:wp="http://schemas.openxmlformats.org/drawingml/2006/wordprocessingDrawing" xmlns:w10="urn:schemas-microsoft-com:office:word" xmlns:w="http://schemas.openxmlformats.org/wordprocessingml/2006/main" xmlns:w14="http://schemas.microsoft.com/office/word/2010/wordml" xmlns:w15="http://schemas.microsoft.com/office/word/2012/wordml" xmlns:w16cex="http://schemas.microsoft.com/office/word/2018/wordml/cex" xmlns:w16cid="http://schemas.microsoft.com/office/word/2016/wordml/cid" xmlns:w16="http://schemas.microsoft.com/office/word/2018/wordml" xmlns:w16du="http://schemas.microsoft.com/office/word/2023/wordml/word16du" xmlns:w16sdtdh="http://schemas.microsoft.com/office/word/2020/wordml/sdtdatahash" xmlns:w16sdtfl="http://schemas.microsoft.com/office/word/2024/wordml/sdtformatlock" xmlns:w16se="http://schemas.microsoft.com/office/word/2015/wordml/symex" xmlns:wpg="http://schemas.microsoft.com/office/word/2010/wordprocessingGroup" xmlns:wpi="http://schemas.microsoft.com/office/word/2010/wordprocessingInk" xmlns:wne="http://schemas.microsoft.com/office/word/2006/wordml" xmlns:wps="http://schemas.microsoft.com/office/word/2010/wordprocessingShape" mc:Ignorable="w14 w15 w16se w16cid w16 w16cex w16sdtdh w16sdtfl w16du wp14">
   <w:body>
-    <w:tbl>
-      <w:tblPr>
-        <w:tblW w:w="6400" w:type="dxa"/>
-        <w:tblBorders>
-          <w:top w:val="none" w:sz="0" w:space="0" w:color="FFFFFF"/>
-          <w:left w:val="none" w:sz="0" w:space="0" w:color="FFFFFF"/>
-          <w:bottom w:val="none" w:sz="0" w:space="0" w:color="FFFFFF"/>
-          <w:right w:val="none" w:sz="0" w:space="0" w:color="FFFFFF"/>
-          <w:insideH w:val="single" w:sz="4" w:space="0" w:color="auto"/>
-          <w:insideV w:val="single" w:sz="4" w:space="0" w:color="auto"/>
-        </w:tblBorders>
-        <w:tblCellMar>
-          <w:left w:w="10" w:type="dxa"/>
-          <w:right w:w="10" w:type="dxa"/>
-        </w:tblCellMar>
-        <w:tblLook w:val="0000" w:firstRow="0" w:lastRow="0" w:firstColumn="0" w:lastColumn="0" w:noHBand="0" w:noVBand="0"/>
-      </w:tblPr>
-      <w:tblGrid>
-        <w:gridCol w:w="6400"/>
-      </w:tblGrid>
-      <w:tr>
-        <w:tc>
-          <w:tcPr>
-            <w:tcW w:w="6400" w:type="dxa"/>
-            <w:tcBorders>
-              <w:top w:val="none" w:sz="0" w:space="0" w:color="FFFFFF"/>
-              <w:left w:val="none" w:sz="0" w:space="0" w:color="FFFFFF"/>
-              <w:bottom w:val="none" w:sz="0" w:space="0" w:color="FFFFFF"/>
-              <w:right w:val="none" w:sz="0" w:space="0" w:color="FFFFFF"/>
-            </w:tcBorders>
-            <w:tcMar>
-              <w:top w:w="0" w:type="dxa"/>
-              <w:left w:w="0" w:type="dxa"/>
-              <w:bottom w:w="0" w:type="dxa"/>
-              <w:right w:w="200" w:type="dxa"/>
-            </w:tcMar>
-          </w:tcPr>
-          <w:p>
-            <w:pPr>
-              <w:spacing w:after="60"/>
-            </w:pPr>
-            <w:r>
-              <w:rPr>
-                <w:b/>
-                <w:bCs/>
-                <w:color w:val="1A5276"/>
-                <w:sz w:val="48"/>
-                <w:szCs w:val="48"/>
-              </w:rPr>
-              <w:t>VIKTAR DZENISEVICH</w:t>
-            </w:r>
-          </w:p>
-          <w:p>
-            <w:pPr>
-              <w:spacing w:after="40"/>
-              <w:rPr>
-                <w:rFonts w:ascii="Cambria" w:hAnsi="Cambria"/>
-                <w:i/>
-                <w:iCs/>
-                <w:color w:val="000000"/>
-                <w:lang w:val="ru-RU"/>
-              </w:rPr>
-            </w:pPr>
-            <w:r>
-              <w:rPr>
-                <w:rFonts w:ascii="Cambria" w:hAnsi="Cambria"/>
-                <w:i/>
-                <w:iCs/>
-                <w:color w:val="000000"/>
-              </w:rPr>
-              <w:t>Partner &amp; Investment Director | Portfolio Value Creation | M&amp;A &amp; Growth Strategy | Emerging-Markets E-commerce, Classifieds &amp; Fintech</w:t>
-            </w:r>
-          </w:p>
-          <w:p>
-            <w:pPr>
-              <w:spacing w:after="40"/>
-            </w:pPr>
-            <w:r>
-              <w:rPr>
-                <w:color w:val="5D6D7E"/>
-                <w:sz w:val="19"/>
-                <w:szCs w:val="19"/>
-              </w:rPr>
-              <w:t>Amsterdam, Netherlands  ·  denwik86@gmail.com  ·  +31 617 471 410</w:t>
-            </w:r>
-          </w:p>
-          <w:p>
-            <w:pPr>
-              <w:rPr>
-                <w:lang w:val="ru-RU"/>
-              </w:rPr>
-            </w:pPr>
-            <w:hyperlink r:id="rId5" w:history="1">
-              <w:r>
-                <w:rPr>
-                  <w:color w:val="1A5276"/>
-                  <w:sz w:val="19"/>
-                  <w:szCs w:val="19"/>
-                  <w:u w:val="single"/>
-                </w:rPr>
-                <w:t>linkedin.com/in/viktar-dzenisevich</w:t>
-              </w:r>
-            </w:hyperlink>
-          </w:p>
-        </w:tc>
-      </w:tr>
-    </w:tbl>
-    <w:p>
-      <w:pPr>
-        <w:pStyle w:val="a4"/>
-        <w:numPr>
-          <w:ilvl w:val="0"/>
-          <w:numId w:val="2"/>
-        </w:numPr>
-        <w:spacing w:before="40" w:after="40"/>
-        <w:jc w:val="both"/>
-      </w:pPr>
-      <w:r>
-        <w:t>Building OpenBaaS (openbaas.io), a Banking-as-a-Service platform for marketplaces, together with my partners; already onboarded first customers and leading product, go-to-market and fundraising.</w:t>
-      </w:r>
-      <w:r/>
-      <w:r/>
-      <w:r/>
-      <w:r/>
-      <w:r/>
-      <w:r/>
-      <w:r/>
-    </w:p>
-    <w:p>
-      <w:pPr>
-        <w:pStyle w:val="a4"/>
-        <w:numPr>
-          <w:ilvl w:val="0"/>
-          <w:numId w:val="2"/>
-        </w:numPr>
-        <w:spacing w:before="40" w:after="40"/>
-        <w:jc w:val="both"/>
-      </w:pPr>
-      <w:r>
-        <w:t>Gradually transitioning out of my day-to-day operational role at Zubr Capital to focus on scaling this fintech, while remaining an active Board member across the portfolio.</w:t>
-      </w:r>
-      <w:r/>
-      <w:r/>
-      <w:r/>
-      <w:r/>
-      <w:r/>
-      <w:r/>
-      <w:r/>
-    </w:p>
     <w:tbl>
       <w:tblPr>
         <w:tblW w:w="6400" w:type="dxa"/>

</xml_diff>

<commit_message>
sync: 2026-07-14 11:07:52 from Cowork
</commit_message>
<xml_diff>
--- a/outputs/cv.docx
+++ b/outputs/cv.docx
@@ -525,6 +525,178 @@
         </w:rPr>
         <w:t>PROFESSIONAL EXPERIENCE</w:t>
       </w:r>
+    </w:p>
+    <w:tbl>
+      <w:tblPr>
+        <w:tblW w:w="9360" w:type="dxa"/>
+        <w:tblBorders>
+          <w:top w:val="none" w:sz="0" w:space="0" w:color="FFFFFF"/>
+          <w:left w:val="none" w:sz="0" w:space="0" w:color="FFFFFF"/>
+          <w:bottom w:val="none" w:sz="0" w:space="0" w:color="FFFFFF"/>
+          <w:right w:val="none" w:sz="0" w:space="0" w:color="FFFFFF"/>
+          <w:insideH w:val="single" w:sz="4" w:space="0" w:color="auto"/>
+          <w:insideV w:val="single" w:sz="4" w:space="0" w:color="auto"/>
+        </w:tblBorders>
+        <w:tblCellMar>
+          <w:left w:w="10" w:type="dxa"/>
+          <w:right w:w="10" w:type="dxa"/>
+        </w:tblCellMar>
+        <w:tblLook w:val="0000" w:firstRow="0" w:lastRow="0" w:firstColumn="0" w:lastColumn="0" w:noHBand="0" w:noVBand="0"/>
+      </w:tblPr>
+      <w:tblGrid>
+        <w:gridCol w:w="6200"/>
+        <w:gridCol w:w="3160"/>
+      </w:tblGrid>
+      <w:tr>
+        <w:tc>
+          <w:tcPr>
+            <w:tcW w:w="6200" w:type="dxa"/>
+            <w:tcBorders>
+              <w:top w:val="none" w:sz="0" w:space="0" w:color="FFFFFF"/>
+              <w:left w:val="none" w:sz="0" w:space="0" w:color="FFFFFF"/>
+              <w:bottom w:val="none" w:sz="0" w:space="0" w:color="FFFFFF"/>
+              <w:right w:val="none" w:sz="0" w:space="0" w:color="FFFFFF"/>
+            </w:tcBorders>
+            <w:tcMar>
+              <w:top w:w="0" w:type="dxa"/>
+              <w:left w:w="0" w:type="dxa"/>
+              <w:bottom w:w="0" w:type="dxa"/>
+              <w:right w:w="0" w:type="dxa"/>
+            </w:tcMar>
+          </w:tcPr>
+          <w:p>
+            <w:pPr>
+              <w:spacing w:before="180"/>
+            </w:pPr>
+            <w:r>
+              <w:rPr>
+                <w:b/>
+                <w:bCs/>
+                <w:sz w:val="22"/>
+                <w:szCs w:val="22"/>
+              </w:rPr>
+              <w:t>Co-Founder</w:t>
+            </w:r>
+          </w:p>
+          <w:p>
+            <w:pPr>
+              <w:spacing w:before="20" w:after="60"/>
+            </w:pPr>
+            <w:r>
+              <w:rPr>
+                <w:i/>
+                <w:iCs/>
+                <w:color w:val="1A5276"/>
+              </w:rPr>
+              <w:t xml:space="preserve">Zubr Capital, Private Equity &amp; </w:t>
+            </w:r>
+            <w:r>
+              <w:rPr>
+                <w:i/>
+                <w:iCs/>
+                <w:color w:val="1A5276"/>
+              </w:rPr>
+              <w:t>Growth</w:t>
+            </w:r>
+            <w:r>
+              <w:rPr>
+                <w:i/>
+                <w:iCs/>
+                <w:color w:val="1A5276"/>
+              </w:rPr>
+              <w:t xml:space="preserve"> Fund</w:t>
+            </w:r>
+          </w:p>
+        </w:tc>
+        <w:tc>
+          <w:tcPr>
+            <w:tcW w:w="3160" w:type="dxa"/>
+            <w:tcBorders>
+              <w:top w:val="none" w:sz="0" w:space="0" w:color="FFFFFF"/>
+              <w:left w:val="none" w:sz="0" w:space="0" w:color="FFFFFF"/>
+              <w:bottom w:val="none" w:sz="0" w:space="0" w:color="FFFFFF"/>
+              <w:right w:val="none" w:sz="0" w:space="0" w:color="FFFFFF"/>
+            </w:tcBorders>
+            <w:tcMar>
+              <w:top w:w="0" w:type="dxa"/>
+              <w:left w:w="0" w:type="dxa"/>
+              <w:bottom w:w="0" w:type="dxa"/>
+              <w:right w:w="0" w:type="dxa"/>
+            </w:tcMar>
+            <w:vAlign w:val="center"/>
+          </w:tcPr>
+          <w:p>
+            <w:pPr>
+              <w:spacing w:before="180"/>
+              <w:jc w:val="right"/>
+            </w:pPr>
+            <w:r>
+              <w:rPr>
+                <w:color w:val="5D6D7E"/>
+                <w:sz w:val="19"/>
+                <w:szCs w:val="19"/>
+              </w:rPr>
+              <w:t>2024 – Present</w:t>
+            </w:r>
+          </w:p>
+          <w:p>
+            <w:pPr>
+              <w:spacing w:before="20" w:after="60"/>
+              <w:jc w:val="right"/>
+            </w:pPr>
+            <w:r>
+              <w:rPr>
+                <w:color w:val="5D6D7E"/>
+                <w:sz w:val="19"/>
+                <w:szCs w:val="19"/>
+              </w:rPr>
+              <w:t>Amsterdam, NL</w:t>
+            </w:r>
+          </w:p>
+        </w:tc>
+      </w:tr>
+    </w:tbl>
+    <w:p>
+      <w:pPr>
+        <w:pStyle w:val="a4"/>
+        <w:numPr>
+          <w:ilvl w:val="0"/>
+          <w:numId w:val="2"/>
+        </w:numPr>
+        <w:spacing w:before="40" w:after="40"/>
+        <w:jc w:val="both"/>
+      </w:pPr>
+      <w:r>
+        <w:t>Building OpenBaaS (openbaas.io), a Banking-as-a-Service platform for marketplaces, together with my partners; already onboarded first customers and leading product, go-to-market and fundraising.</w:t>
+      </w:r>
+      <w:r/>
+      <w:r/>
+      <w:r/>
+      <w:r/>
+      <w:r/>
+      <w:r/>
+      <w:r/>
+    </w:p>
+    <w:p>
+      <w:pPr>
+        <w:pStyle w:val="a4"/>
+        <w:numPr>
+          <w:ilvl w:val="0"/>
+          <w:numId w:val="2"/>
+        </w:numPr>
+        <w:spacing w:before="40" w:after="40"/>
+        <w:jc w:val="both"/>
+      </w:pPr>
+      <w:r>
+        <w:t>Gradually transitioning out of my day-to-day operational role at Zubr Capital to focus on scaling this fintech, while remaining an active Board member across the portfolio.</w:t>
+      </w:r>
+      <w:r/>
+      <w:r/>
+      <w:r/>
+      <w:r/>
+      <w:r/>
+      <w:r/>
+      <w:r/>
     </w:p>
     <w:tbl>
       <w:tblPr>

</xml_diff>

<commit_message>
sync: 2026-07-14 11:08:05 from Cowork
</commit_message>
<xml_diff>
--- a/outputs/cv.docx
+++ b/outputs/cv.docx
@@ -588,7 +588,7 @@
                 <w:iCs/>
                 <w:color w:val="1A5276"/>
               </w:rPr>
-              <w:t xml:space="preserve">Zubr Capital, Private Equity &amp; </w:t>
+              <w:t>OpenBaaS · openbaas.io · Banking-as-a-Service for marketplaces</w:t>
             </w:r>
             <w:r>
               <w:rPr>
@@ -596,7 +596,6 @@
                 <w:iCs/>
                 <w:color w:val="1A5276"/>
               </w:rPr>
-              <w:t>Growth</w:t>
             </w:r>
             <w:r>
               <w:rPr>
@@ -604,7 +603,6 @@
                 <w:iCs/>
                 <w:color w:val="1A5276"/>
               </w:rPr>
-              <w:t xml:space="preserve"> Fund</w:t>
             </w:r>
           </w:p>
         </w:tc>

</xml_diff>